<commit_message>
Added scripts for manual testing. Updated DEFAULT_ENG_invoice.docx.
</commit_message>
<xml_diff>
--- a/app/db/seed_data/templates/DEFAULT_ENG_invoice.docx
+++ b/app/db/seed_data/templates/DEFAULT_ENG_invoice.docx
@@ -934,43 +934,7 @@
     <w:p>
       <w:pPr>
         <w:jc w:val="center"/>
-        <w:rPr>
-          <w:rFonts w:ascii="Arial" w:cs="Arial" w:eastAsia="Arial" w:hAnsi="Arial"/>
-          <w:sz w:val="20"/>
-          <w:szCs w:val="20"/>
-        </w:rPr>
-      </w:pPr>
-      <w:r>
-        <w:rPr>
-          <w:rFonts w:ascii="Arial" w:cs="Arial" w:eastAsia="Arial" w:hAnsi="Arial"/>
-          <w:sz w:val="20"/>
-          <w:szCs w:val="20"/>
-          <w:rtl w:val="0"/>
-        </w:rPr>
-        <w:t xml:space="preserve">{{ invoice_table }}</w:t>
-      </w:r>
-    </w:p>
-    <w:p>
-      <w:pPr>
-        <w:rPr>
-          <w:rFonts w:ascii="Arial" w:cs="Arial" w:eastAsia="Arial" w:hAnsi="Arial"/>
-          <w:sz w:val="20"/>
-          <w:szCs w:val="20"/>
-        </w:rPr>
-      </w:pPr>
-      <w:r>
-        <w:rPr>
-          <w:rtl w:val="0"/>
-        </w:rPr>
-      </w:r>
-    </w:p>
-    <w:p>
-      <w:pPr>
-        <w:rPr>
-          <w:rFonts w:ascii="Arial" w:cs="Arial" w:eastAsia="Arial" w:hAnsi="Arial"/>
-          <w:sz w:val="20"/>
-          <w:szCs w:val="20"/>
-        </w:rPr>
+        <w:rPr/>
       </w:pPr>
       <w:r>
         <w:rPr>
@@ -981,6 +945,100 @@
     <w:tbl>
       <w:tblPr>
         <w:tblStyle w:val="Table4"/>
+        <w:tblW w:w="9746.0" w:type="dxa"/>
+        <w:jc w:val="center"/>
+        <w:tblBorders>
+          <w:top w:color="000000" w:space="0" w:sz="8" w:val="single"/>
+          <w:left w:color="000000" w:space="0" w:sz="8" w:val="single"/>
+          <w:bottom w:color="000000" w:space="0" w:sz="8" w:val="single"/>
+          <w:right w:color="000000" w:space="0" w:sz="8" w:val="single"/>
+          <w:insideH w:color="000000" w:space="0" w:sz="8" w:val="single"/>
+          <w:insideV w:color="000000" w:space="0" w:sz="8" w:val="single"/>
+        </w:tblBorders>
+        <w:tblLayout w:type="fixed"/>
+        <w:tblLook w:val="0600"/>
+      </w:tblPr>
+      <w:tblGrid>
+        <w:gridCol w:w="9746"/>
+        <w:tblGridChange w:id="0">
+          <w:tblGrid>
+            <w:gridCol w:w="9746"/>
+          </w:tblGrid>
+        </w:tblGridChange>
+      </w:tblGrid>
+      <w:tr>
+        <w:trPr>
+          <w:cantSplit w:val="0"/>
+          <w:tblHeader w:val="0"/>
+        </w:trPr>
+        <w:tc>
+          <w:tcPr>
+            <w:shd w:fill="auto" w:val="clear"/>
+            <w:tcMar>
+              <w:top w:w="100.0" w:type="dxa"/>
+              <w:left w:w="100.0" w:type="dxa"/>
+              <w:bottom w:w="100.0" w:type="dxa"/>
+              <w:right w:w="100.0" w:type="dxa"/>
+            </w:tcMar>
+            <w:vAlign w:val="top"/>
+          </w:tcPr>
+          <w:p>
+            <w:pPr>
+              <w:jc w:val="center"/>
+              <w:rPr/>
+            </w:pPr>
+            <w:r>
+              <w:rPr>
+                <w:rtl w:val="0"/>
+              </w:rPr>
+              <w:t xml:space="preserve">{{ invoice_table }}</w:t>
+            </w:r>
+          </w:p>
+        </w:tc>
+      </w:tr>
+    </w:tbl>
+    <w:p>
+      <w:pPr>
+        <w:jc w:val="center"/>
+        <w:rPr/>
+      </w:pPr>
+      <w:r>
+        <w:rPr>
+          <w:rtl w:val="0"/>
+        </w:rPr>
+      </w:r>
+    </w:p>
+    <w:p>
+      <w:pPr>
+        <w:rPr>
+          <w:rFonts w:ascii="Arial" w:cs="Arial" w:eastAsia="Arial" w:hAnsi="Arial"/>
+          <w:sz w:val="20"/>
+          <w:szCs w:val="20"/>
+        </w:rPr>
+      </w:pPr>
+      <w:r>
+        <w:rPr>
+          <w:rtl w:val="0"/>
+        </w:rPr>
+      </w:r>
+    </w:p>
+    <w:p>
+      <w:pPr>
+        <w:rPr>
+          <w:rFonts w:ascii="Arial" w:cs="Arial" w:eastAsia="Arial" w:hAnsi="Arial"/>
+          <w:sz w:val="20"/>
+          <w:szCs w:val="20"/>
+        </w:rPr>
+      </w:pPr>
+      <w:r>
+        <w:rPr>
+          <w:rtl w:val="0"/>
+        </w:rPr>
+      </w:r>
+    </w:p>
+    <w:tbl>
+      <w:tblPr>
+        <w:tblStyle w:val="Table5"/>
         <w:tblW w:w="9746.0" w:type="dxa"/>
         <w:jc w:val="center"/>
         <w:tblBorders>
@@ -1264,6 +1322,13 @@
     </w:tblPr>
   </w:style>
   <w:style w:type="table" w:styleId="Table4">
+    <w:basedOn w:val="TableNormal"/>
+    <w:tblPr>
+      <w:tblStyleRowBandSize w:val="1"/>
+      <w:tblStyleColBandSize w:val="1"/>
+    </w:tblPr>
+  </w:style>
+  <w:style w:type="table" w:styleId="Table5">
     <w:basedOn w:val="TableNormal"/>
     <w:tblPr>
       <w:tblStyleRowBandSize w:val="1"/>

</xml_diff>

<commit_message>
Added Document sequence CRUD.
</commit_message>
<xml_diff>
--- a/app/db/seed_data/templates/DEFAULT_ENG_invoice.docx
+++ b/app/db/seed_data/templates/DEFAULT_ENG_invoice.docx
@@ -523,7 +523,22 @@
                       <w:szCs w:val="20"/>
                       <w:rtl w:val="0"/>
                     </w:rPr>
-                    <w:t xml:space="preserve">{{ prefix }}-{{ id }}</w:t>
+                    <w:t xml:space="preserve">{{ prefix, id, sep</w:t>
+                  </w:r>
+                  <w:r>
+                    <w:rPr>
+                      <w:rtl w:val="0"/>
+                    </w:rPr>
+                    <w:t xml:space="preserve">=”-”</w:t>
+                  </w:r>
+                  <w:r>
+                    <w:rPr>
+                      <w:rFonts w:ascii="Arial" w:cs="Arial" w:eastAsia="Arial" w:hAnsi="Arial"/>
+                      <w:sz w:val="20"/>
+                      <w:szCs w:val="20"/>
+                      <w:rtl w:val="0"/>
+                    </w:rPr>
+                    <w:t xml:space="preserve"> }}</w:t>
                   </w:r>
                 </w:p>
               </w:tc>

</xml_diff>